<commit_message>
deal screen: update nan.docx
</commit_message>
<xml_diff>
--- a/hub/static/research/companies/nan.docx
+++ b/hub/static/research/companies/nan.docx
@@ -67,7 +67,7 @@
     </w:p>
     <w:p>
       <w:pPr>
-        <w:spacing w:before="120" w:after="40"/>
+        <w:spacing w:before="120" w:after="240"/>
       </w:pPr>
       <w:r>
         <w:rPr>
@@ -77,7 +77,7 @@
           <w:color w:val="1A1A1A"/>
           <w:sz w:val="32"/>
         </w:rPr>
-        <w:t>2.4 / 4.0</w:t>
+        <w:t>0.0 / 4.0</w:t>
       </w:r>
       <w:r>
         <w:rPr>
@@ -87,7 +87,7 @@
           <w:color w:val="828282"/>
           <w:sz w:val="21"/>
         </w:rPr>
-        <w:t xml:space="preserve">   (raw 2.4)</w:t>
+        <w:t xml:space="preserve">   (raw 0.0)</w:t>
       </w:r>
       <w:r>
         <w:rPr>
@@ -97,22 +97,7 @@
           <w:color w:val="828282"/>
           <w:sz w:val="21"/>
         </w:rPr>
-        <w:t xml:space="preserve">   —   PASS — HARD AUTO-PASS</w:t>
-      </w:r>
-    </w:p>
-    <w:p>
-      <w:pPr>
-        <w:spacing w:after="240"/>
-      </w:pPr>
-      <w:r>
-        <w:rPr>
-          <w:rFonts w:ascii="Sora" w:hAnsi="Sora"/>
-          <w:b w:val="0"/>
-          <w:caps w:val="0"/>
-          <w:color w:val="3C3C3C"/>
-          <w:sz w:val="19"/>
-        </w:rPr>
-        <w:t>Hard auto-pass: Founder red flags -- verified negative history in Integrity subcategory (racist posts and regulatory conflict-of-interest warnings).</w:t>
+        <w:t xml:space="preserve">   —   SCORING FAILED — NOT SCREENED</w:t>
       </w:r>
     </w:p>
     <w:tbl>
@@ -200,618 +185,6 @@
           </w:p>
         </w:tc>
       </w:tr>
-      <w:tr>
-        <w:tc>
-          <w:tcPr>
-            <w:tcW w:type="dxa" w:w="2664"/>
-            <w:shd w:val="clear" w:color="auto" w:fill="F5F5F5"/>
-            <w:tcMar>
-              <w:top w:w="40" w:type="dxa"/>
-              <w:bottom w:w="40" w:type="dxa"/>
-              <w:left w:w="60" w:type="dxa"/>
-              <w:right w:w="60" w:type="dxa"/>
-            </w:tcMar>
-            <w:tcBorders>
-              <w:top w:val="nil"/>
-              <w:left w:val="nil"/>
-              <w:right w:val="nil"/>
-              <w:bottom w:val="single" w:sz="4" w:color="E4DFD5"/>
-            </w:tcBorders>
-          </w:tcPr>
-          <w:p>
-            <w:r>
-              <w:rPr>
-                <w:rFonts w:ascii="Sora" w:hAnsi="Sora"/>
-                <w:b w:val="0"/>
-                <w:caps w:val="0"/>
-                <w:color w:val="1A1A1A"/>
-                <w:sz w:val="19"/>
-              </w:rPr>
-              <w:t>Lead / Round Dynamics</w:t>
-            </w:r>
-          </w:p>
-        </w:tc>
-        <w:tc>
-          <w:tcPr>
-            <w:tcW w:type="dxa" w:w="792"/>
-            <w:shd w:val="clear" w:color="auto" w:fill="F5F5F5"/>
-            <w:tcMar>
-              <w:top w:w="40" w:type="dxa"/>
-              <w:bottom w:w="40" w:type="dxa"/>
-              <w:left w:w="60" w:type="dxa"/>
-              <w:right w:w="60" w:type="dxa"/>
-            </w:tcMar>
-            <w:tcBorders>
-              <w:top w:val="nil"/>
-              <w:left w:val="nil"/>
-              <w:right w:val="nil"/>
-              <w:bottom w:val="single" w:sz="4" w:color="E4DFD5"/>
-            </w:tcBorders>
-          </w:tcPr>
-          <w:p>
-            <w:r>
-              <w:rPr>
-                <w:rFonts w:ascii="Sora" w:hAnsi="Sora"/>
-                <w:b/>
-                <w:caps w:val="0"/>
-                <w:color w:val="1A1A1A"/>
-                <w:sz w:val="19"/>
-              </w:rPr>
-              <w:t>2.5</w:t>
-            </w:r>
-            <w:r>
-              <w:rPr>
-                <w:rFonts w:ascii="Sora" w:hAnsi="Sora"/>
-                <w:b w:val="0"/>
-                <w:caps w:val="0"/>
-                <w:color w:val="828282"/>
-                <w:sz w:val="17"/>
-              </w:rPr>
-              <w:t xml:space="preserve"> / 4</w:t>
-            </w:r>
-          </w:p>
-        </w:tc>
-        <w:tc>
-          <w:tcPr>
-            <w:tcW w:type="dxa" w:w="5904"/>
-            <w:shd w:val="clear" w:color="auto" w:fill="F5F5F5"/>
-            <w:tcMar>
-              <w:top w:w="40" w:type="dxa"/>
-              <w:bottom w:w="40" w:type="dxa"/>
-              <w:left w:w="60" w:type="dxa"/>
-              <w:right w:w="60" w:type="dxa"/>
-            </w:tcMar>
-            <w:tcBorders>
-              <w:top w:val="nil"/>
-              <w:left w:val="nil"/>
-              <w:right w:val="nil"/>
-              <w:bottom w:val="single" w:sz="4" w:color="E4DFD5"/>
-            </w:tcBorders>
-          </w:tcPr>
-          <w:p>
-            <w:r>
-              <w:rPr>
-                <w:rFonts w:ascii="Sora" w:hAnsi="Sora"/>
-                <w:b w:val="0"/>
-                <w:caps w:val="0"/>
-                <w:color w:val="3C3C3C"/>
-                <w:sz w:val="18"/>
-              </w:rPr>
-              <w:t>Tier-1+ co-leads a large first institutional round, but stage and prior cap table history remain undisclosed, limiting verification of momentum and motivation.</w:t>
-            </w:r>
-          </w:p>
-        </w:tc>
-      </w:tr>
-      <w:tr>
-        <w:tc>
-          <w:tcPr>
-            <w:tcW w:type="dxa" w:w="2664"/>
-            <w:shd w:val="clear" w:color="auto" w:fill="FFFFFF"/>
-            <w:tcMar>
-              <w:top w:w="40" w:type="dxa"/>
-              <w:bottom w:w="40" w:type="dxa"/>
-              <w:left w:w="60" w:type="dxa"/>
-              <w:right w:w="60" w:type="dxa"/>
-            </w:tcMar>
-            <w:tcBorders>
-              <w:top w:val="nil"/>
-              <w:left w:val="nil"/>
-              <w:right w:val="nil"/>
-              <w:bottom w:val="single" w:sz="4" w:color="E4DFD5"/>
-            </w:tcBorders>
-          </w:tcPr>
-          <w:p>
-            <w:r>
-              <w:rPr>
-                <w:rFonts w:ascii="Sora" w:hAnsi="Sora"/>
-                <w:b w:val="0"/>
-                <w:caps w:val="0"/>
-                <w:color w:val="1A1A1A"/>
-                <w:sz w:val="19"/>
-              </w:rPr>
-              <w:t>Founder / Team Quality</w:t>
-            </w:r>
-          </w:p>
-        </w:tc>
-        <w:tc>
-          <w:tcPr>
-            <w:tcW w:type="dxa" w:w="792"/>
-            <w:shd w:val="clear" w:color="auto" w:fill="FFFFFF"/>
-            <w:tcMar>
-              <w:top w:w="40" w:type="dxa"/>
-              <w:bottom w:w="40" w:type="dxa"/>
-              <w:left w:w="60" w:type="dxa"/>
-              <w:right w:w="60" w:type="dxa"/>
-            </w:tcMar>
-            <w:tcBorders>
-              <w:top w:val="nil"/>
-              <w:left w:val="nil"/>
-              <w:right w:val="nil"/>
-              <w:bottom w:val="single" w:sz="4" w:color="E4DFD5"/>
-            </w:tcBorders>
-          </w:tcPr>
-          <w:p>
-            <w:r>
-              <w:rPr>
-                <w:rFonts w:ascii="Sora" w:hAnsi="Sora"/>
-                <w:b/>
-                <w:caps w:val="0"/>
-                <w:color w:val="1A1A1A"/>
-                <w:sz w:val="19"/>
-              </w:rPr>
-              <w:t>2.5</w:t>
-            </w:r>
-            <w:r>
-              <w:rPr>
-                <w:rFonts w:ascii="Sora" w:hAnsi="Sora"/>
-                <w:b w:val="0"/>
-                <w:caps w:val="0"/>
-                <w:color w:val="828282"/>
-                <w:sz w:val="17"/>
-              </w:rPr>
-              <w:t xml:space="preserve"> / 4</w:t>
-            </w:r>
-          </w:p>
-        </w:tc>
-        <w:tc>
-          <w:tcPr>
-            <w:tcW w:type="dxa" w:w="5904"/>
-            <w:shd w:val="clear" w:color="auto" w:fill="FFFFFF"/>
-            <w:tcMar>
-              <w:top w:w="40" w:type="dxa"/>
-              <w:bottom w:w="40" w:type="dxa"/>
-              <w:left w:w="60" w:type="dxa"/>
-              <w:right w:w="60" w:type="dxa"/>
-            </w:tcMar>
-            <w:tcBorders>
-              <w:top w:val="nil"/>
-              <w:left w:val="nil"/>
-              <w:right w:val="nil"/>
-              <w:bottom w:val="single" w:sz="4" w:color="E4DFD5"/>
-            </w:tcBorders>
-          </w:tcPr>
-          <w:p>
-            <w:r>
-              <w:rPr>
-                <w:rFonts w:ascii="Sora" w:hAnsi="Sora"/>
-                <w:b w:val="0"/>
-                <w:caps w:val="0"/>
-                <w:color w:val="3C3C3C"/>
-                <w:sz w:val="18"/>
-              </w:rPr>
-              <w:t>Founders bring strong technical and government backgrounds with notable public profiles, but serious integrity concerns around at least two co-founders materially weaken overall team quality.</w:t>
-            </w:r>
-          </w:p>
-        </w:tc>
-      </w:tr>
-      <w:tr>
-        <w:tc>
-          <w:tcPr>
-            <w:tcW w:type="dxa" w:w="2664"/>
-            <w:shd w:val="clear" w:color="auto" w:fill="F5F5F5"/>
-            <w:tcMar>
-              <w:top w:w="40" w:type="dxa"/>
-              <w:bottom w:w="40" w:type="dxa"/>
-              <w:left w:w="60" w:type="dxa"/>
-              <w:right w:w="60" w:type="dxa"/>
-            </w:tcMar>
-            <w:tcBorders>
-              <w:top w:val="nil"/>
-              <w:left w:val="nil"/>
-              <w:right w:val="nil"/>
-              <w:bottom w:val="single" w:sz="4" w:color="E4DFD5"/>
-            </w:tcBorders>
-          </w:tcPr>
-          <w:p>
-            <w:r>
-              <w:rPr>
-                <w:rFonts w:ascii="Sora" w:hAnsi="Sora"/>
-                <w:b w:val="0"/>
-                <w:caps w:val="0"/>
-                <w:color w:val="1A1A1A"/>
-                <w:sz w:val="19"/>
-              </w:rPr>
-              <w:t>AI Score</w:t>
-            </w:r>
-          </w:p>
-        </w:tc>
-        <w:tc>
-          <w:tcPr>
-            <w:tcW w:type="dxa" w:w="792"/>
-            <w:shd w:val="clear" w:color="auto" w:fill="F5F5F5"/>
-            <w:tcMar>
-              <w:top w:w="40" w:type="dxa"/>
-              <w:bottom w:w="40" w:type="dxa"/>
-              <w:left w:w="60" w:type="dxa"/>
-              <w:right w:w="60" w:type="dxa"/>
-            </w:tcMar>
-            <w:tcBorders>
-              <w:top w:val="nil"/>
-              <w:left w:val="nil"/>
-              <w:right w:val="nil"/>
-              <w:bottom w:val="single" w:sz="4" w:color="E4DFD5"/>
-            </w:tcBorders>
-          </w:tcPr>
-          <w:p>
-            <w:r>
-              <w:rPr>
-                <w:rFonts w:ascii="Sora" w:hAnsi="Sora"/>
-                <w:b/>
-                <w:caps w:val="0"/>
-                <w:color w:val="1A1A1A"/>
-                <w:sz w:val="19"/>
-              </w:rPr>
-              <w:t>2.0</w:t>
-            </w:r>
-            <w:r>
-              <w:rPr>
-                <w:rFonts w:ascii="Sora" w:hAnsi="Sora"/>
-                <w:b w:val="0"/>
-                <w:caps w:val="0"/>
-                <w:color w:val="828282"/>
-                <w:sz w:val="17"/>
-              </w:rPr>
-              <w:t xml:space="preserve"> / 4</w:t>
-            </w:r>
-          </w:p>
-        </w:tc>
-        <w:tc>
-          <w:tcPr>
-            <w:tcW w:type="dxa" w:w="5904"/>
-            <w:shd w:val="clear" w:color="auto" w:fill="F5F5F5"/>
-            <w:tcMar>
-              <w:top w:w="40" w:type="dxa"/>
-              <w:bottom w:w="40" w:type="dxa"/>
-              <w:left w:w="60" w:type="dxa"/>
-              <w:right w:w="60" w:type="dxa"/>
-            </w:tcMar>
-            <w:tcBorders>
-              <w:top w:val="nil"/>
-              <w:left w:val="nil"/>
-              <w:right w:val="nil"/>
-              <w:bottom w:val="single" w:sz="4" w:color="E4DFD5"/>
-            </w:tcBorders>
-          </w:tcPr>
-          <w:p>
-            <w:r>
-              <w:rPr>
-                <w:rFonts w:ascii="Sora" w:hAnsi="Sora"/>
-                <w:b w:val="0"/>
-                <w:caps w:val="0"/>
-                <w:color w:val="3C3C3C"/>
-                <w:sz w:val="18"/>
-              </w:rPr>
-              <w:t>AI is central to Cathedral’s cyber operations and agent-identity vision, but there is no disclosed proprietary model architecture or demonstrated data flywheel yet.</w:t>
-            </w:r>
-          </w:p>
-        </w:tc>
-      </w:tr>
-      <w:tr>
-        <w:tc>
-          <w:tcPr>
-            <w:tcW w:type="dxa" w:w="2664"/>
-            <w:shd w:val="clear" w:color="auto" w:fill="FFFFFF"/>
-            <w:tcMar>
-              <w:top w:w="40" w:type="dxa"/>
-              <w:bottom w:w="40" w:type="dxa"/>
-              <w:left w:w="60" w:type="dxa"/>
-              <w:right w:w="60" w:type="dxa"/>
-            </w:tcMar>
-            <w:tcBorders>
-              <w:top w:val="nil"/>
-              <w:left w:val="nil"/>
-              <w:right w:val="nil"/>
-              <w:bottom w:val="single" w:sz="4" w:color="E4DFD5"/>
-            </w:tcBorders>
-          </w:tcPr>
-          <w:p>
-            <w:r>
-              <w:rPr>
-                <w:rFonts w:ascii="Sora" w:hAnsi="Sora"/>
-                <w:b w:val="0"/>
-                <w:caps w:val="0"/>
-                <w:color w:val="1A1A1A"/>
-                <w:sz w:val="19"/>
-              </w:rPr>
-              <w:t>Terms</w:t>
-            </w:r>
-          </w:p>
-        </w:tc>
-        <w:tc>
-          <w:tcPr>
-            <w:tcW w:type="dxa" w:w="792"/>
-            <w:shd w:val="clear" w:color="auto" w:fill="FFFFFF"/>
-            <w:tcMar>
-              <w:top w:w="40" w:type="dxa"/>
-              <w:bottom w:w="40" w:type="dxa"/>
-              <w:left w:w="60" w:type="dxa"/>
-              <w:right w:w="60" w:type="dxa"/>
-            </w:tcMar>
-            <w:tcBorders>
-              <w:top w:val="nil"/>
-              <w:left w:val="nil"/>
-              <w:right w:val="nil"/>
-              <w:bottom w:val="single" w:sz="4" w:color="E4DFD5"/>
-            </w:tcBorders>
-          </w:tcPr>
-          <w:p>
-            <w:r>
-              <w:rPr>
-                <w:rFonts w:ascii="Sora" w:hAnsi="Sora"/>
-                <w:b/>
-                <w:caps w:val="0"/>
-                <w:color w:val="1A1A1A"/>
-                <w:sz w:val="19"/>
-              </w:rPr>
-              <w:t>3.0</w:t>
-            </w:r>
-            <w:r>
-              <w:rPr>
-                <w:rFonts w:ascii="Sora" w:hAnsi="Sora"/>
-                <w:b w:val="0"/>
-                <w:caps w:val="0"/>
-                <w:color w:val="828282"/>
-                <w:sz w:val="17"/>
-              </w:rPr>
-              <w:t xml:space="preserve"> / 4</w:t>
-            </w:r>
-          </w:p>
-        </w:tc>
-        <w:tc>
-          <w:tcPr>
-            <w:tcW w:type="dxa" w:w="5904"/>
-            <w:shd w:val="clear" w:color="auto" w:fill="FFFFFF"/>
-            <w:tcMar>
-              <w:top w:w="40" w:type="dxa"/>
-              <w:bottom w:w="40" w:type="dxa"/>
-              <w:left w:w="60" w:type="dxa"/>
-              <w:right w:w="60" w:type="dxa"/>
-            </w:tcMar>
-            <w:tcBorders>
-              <w:top w:val="nil"/>
-              <w:left w:val="nil"/>
-              <w:right w:val="nil"/>
-              <w:bottom w:val="single" w:sz="4" w:color="E4DFD5"/>
-            </w:tcBorders>
-          </w:tcPr>
-          <w:p>
-            <w:r>
-              <w:rPr>
-                <w:rFonts w:ascii="Sora" w:hAnsi="Sora"/>
-                <w:b w:val="0"/>
-                <w:caps w:val="0"/>
-                <w:color w:val="3C3C3C"/>
-                <w:sz w:val="18"/>
-              </w:rPr>
-              <w:t>Round appears to be a standard VC-led primary with no public indication of atypical economics, so terms are assumed baseline but unverified.</w:t>
-            </w:r>
-          </w:p>
-        </w:tc>
-      </w:tr>
-      <w:tr>
-        <w:tc>
-          <w:tcPr>
-            <w:tcW w:type="dxa" w:w="2664"/>
-            <w:shd w:val="clear" w:color="auto" w:fill="F5F5F5"/>
-            <w:tcMar>
-              <w:top w:w="40" w:type="dxa"/>
-              <w:bottom w:w="40" w:type="dxa"/>
-              <w:left w:w="60" w:type="dxa"/>
-              <w:right w:w="60" w:type="dxa"/>
-            </w:tcMar>
-            <w:tcBorders>
-              <w:top w:val="nil"/>
-              <w:left w:val="nil"/>
-              <w:right w:val="nil"/>
-              <w:bottom w:val="single" w:sz="4" w:color="E4DFD5"/>
-            </w:tcBorders>
-          </w:tcPr>
-          <w:p>
-            <w:r>
-              <w:rPr>
-                <w:rFonts w:ascii="Sora" w:hAnsi="Sora"/>
-                <w:b w:val="0"/>
-                <w:caps w:val="0"/>
-                <w:color w:val="1A1A1A"/>
-                <w:sz w:val="19"/>
-              </w:rPr>
-              <w:t>Fundamentals</w:t>
-            </w:r>
-          </w:p>
-        </w:tc>
-        <w:tc>
-          <w:tcPr>
-            <w:tcW w:type="dxa" w:w="792"/>
-            <w:shd w:val="clear" w:color="auto" w:fill="F5F5F5"/>
-            <w:tcMar>
-              <w:top w:w="40" w:type="dxa"/>
-              <w:bottom w:w="40" w:type="dxa"/>
-              <w:left w:w="60" w:type="dxa"/>
-              <w:right w:w="60" w:type="dxa"/>
-            </w:tcMar>
-            <w:tcBorders>
-              <w:top w:val="nil"/>
-              <w:left w:val="nil"/>
-              <w:right w:val="nil"/>
-              <w:bottom w:val="single" w:sz="4" w:color="E4DFD5"/>
-            </w:tcBorders>
-          </w:tcPr>
-          <w:p>
-            <w:r>
-              <w:rPr>
-                <w:rFonts w:ascii="Sora" w:hAnsi="Sora"/>
-                <w:b/>
-                <w:caps w:val="0"/>
-                <w:color w:val="1A1A1A"/>
-                <w:sz w:val="19"/>
-              </w:rPr>
-              <w:t>2.4</w:t>
-            </w:r>
-            <w:r>
-              <w:rPr>
-                <w:rFonts w:ascii="Sora" w:hAnsi="Sora"/>
-                <w:b w:val="0"/>
-                <w:caps w:val="0"/>
-                <w:color w:val="828282"/>
-                <w:sz w:val="17"/>
-              </w:rPr>
-              <w:t xml:space="preserve"> / 4</w:t>
-            </w:r>
-          </w:p>
-        </w:tc>
-        <w:tc>
-          <w:tcPr>
-            <w:tcW w:type="dxa" w:w="5904"/>
-            <w:shd w:val="clear" w:color="auto" w:fill="F5F5F5"/>
-            <w:tcMar>
-              <w:top w:w="40" w:type="dxa"/>
-              <w:bottom w:w="40" w:type="dxa"/>
-              <w:left w:w="60" w:type="dxa"/>
-              <w:right w:w="60" w:type="dxa"/>
-            </w:tcMar>
-            <w:tcBorders>
-              <w:top w:val="nil"/>
-              <w:left w:val="nil"/>
-              <w:right w:val="nil"/>
-              <w:bottom w:val="single" w:sz="4" w:color="E4DFD5"/>
-            </w:tcBorders>
-          </w:tcPr>
-          <w:p>
-            <w:r>
-              <w:rPr>
-                <w:rFonts w:ascii="Sora" w:hAnsi="Sora"/>
-                <w:b w:val="0"/>
-                <w:caps w:val="0"/>
-                <w:color w:val="3C3C3C"/>
-                <w:sz w:val="18"/>
-              </w:rPr>
-              <w:t>Financial metrics are undisclosed, but the company targets a large defense-focused cyber market with an AI-driven product and government-relations moat, implying potential but unproven fundamentals.</w:t>
-            </w:r>
-          </w:p>
-        </w:tc>
-      </w:tr>
-      <w:tr>
-        <w:tc>
-          <w:tcPr>
-            <w:tcW w:type="dxa" w:w="2664"/>
-            <w:shd w:val="clear" w:color="auto" w:fill="FFFFFF"/>
-            <w:tcMar>
-              <w:top w:w="40" w:type="dxa"/>
-              <w:bottom w:w="40" w:type="dxa"/>
-              <w:left w:w="60" w:type="dxa"/>
-              <w:right w:w="60" w:type="dxa"/>
-            </w:tcMar>
-            <w:tcBorders>
-              <w:top w:val="nil"/>
-              <w:left w:val="nil"/>
-              <w:right w:val="nil"/>
-              <w:bottom w:val="single" w:sz="4" w:color="E4DFD5"/>
-            </w:tcBorders>
-          </w:tcPr>
-          <w:p>
-            <w:r>
-              <w:rPr>
-                <w:rFonts w:ascii="Sora" w:hAnsi="Sora"/>
-                <w:b w:val="0"/>
-                <w:caps w:val="0"/>
-                <w:color w:val="1A1A1A"/>
-                <w:sz w:val="19"/>
-              </w:rPr>
-              <w:t>Return Potential</w:t>
-            </w:r>
-          </w:p>
-        </w:tc>
-        <w:tc>
-          <w:tcPr>
-            <w:tcW w:type="dxa" w:w="792"/>
-            <w:shd w:val="clear" w:color="auto" w:fill="FFFFFF"/>
-            <w:tcMar>
-              <w:top w:w="40" w:type="dxa"/>
-              <w:bottom w:w="40" w:type="dxa"/>
-              <w:left w:w="60" w:type="dxa"/>
-              <w:right w:w="60" w:type="dxa"/>
-            </w:tcMar>
-            <w:tcBorders>
-              <w:top w:val="nil"/>
-              <w:left w:val="nil"/>
-              <w:right w:val="nil"/>
-              <w:bottom w:val="single" w:sz="4" w:color="E4DFD5"/>
-            </w:tcBorders>
-          </w:tcPr>
-          <w:p>
-            <w:r>
-              <w:rPr>
-                <w:rFonts w:ascii="Sora" w:hAnsi="Sora"/>
-                <w:b/>
-                <w:caps w:val="0"/>
-                <w:color w:val="1A1A1A"/>
-                <w:sz w:val="19"/>
-              </w:rPr>
-              <w:t>2.2</w:t>
-            </w:r>
-            <w:r>
-              <w:rPr>
-                <w:rFonts w:ascii="Sora" w:hAnsi="Sora"/>
-                <w:b w:val="0"/>
-                <w:caps w:val="0"/>
-                <w:color w:val="828282"/>
-                <w:sz w:val="17"/>
-              </w:rPr>
-              <w:t xml:space="preserve"> / 4</w:t>
-            </w:r>
-          </w:p>
-        </w:tc>
-        <w:tc>
-          <w:tcPr>
-            <w:tcW w:type="dxa" w:w="5904"/>
-            <w:shd w:val="clear" w:color="auto" w:fill="FFFFFF"/>
-            <w:tcMar>
-              <w:top w:w="40" w:type="dxa"/>
-              <w:bottom w:w="40" w:type="dxa"/>
-              <w:left w:w="60" w:type="dxa"/>
-              <w:right w:w="60" w:type="dxa"/>
-            </w:tcMar>
-            <w:tcBorders>
-              <w:top w:val="nil"/>
-              <w:left w:val="nil"/>
-              <w:right w:val="nil"/>
-              <w:bottom w:val="single" w:sz="4" w:color="E4DFD5"/>
-            </w:tcBorders>
-          </w:tcPr>
-          <w:p>
-            <w:r>
-              <w:rPr>
-                <w:rFonts w:ascii="Sora" w:hAnsi="Sora"/>
-                <w:b w:val="0"/>
-                <w:caps w:val="0"/>
-                <w:color w:val="3C3C3C"/>
-                <w:sz w:val="18"/>
-              </w:rPr>
-              <w:t>Large TAM, Tier-1 backing, and defense positioning support meaningful upside, but absent financials and exit precedent data, modeled MOIC and IRR remain speculative.</w:t>
-            </w:r>
-          </w:p>
-        </w:tc>
-      </w:tr>
     </w:tbl>
     <w:p>
       <w:pPr>
@@ -849,7 +222,7 @@
           <w:color w:val="1A1A1A"/>
           <w:sz w:val="21"/>
         </w:rPr>
-        <w:t>Cathedral aligns with ID8's AI-focused thesis and benefits from new-money Tier-1 co-leads, but severe founder integrity red flags trigger a hard auto-pass regardless of otherwise attractive market and return potential. Stage appears in mandate; no watch-list filing.</w:t>
+        <w:t>scoring failed: 401 Client Error: Unauthorized for url: https://api.perplexity.ai/chat/completions</w:t>
       </w:r>
     </w:p>
     <w:p>

</xml_diff>